<commit_message>
Sprint Review 1: infraestructura al Sprint 6 y nada de la app como realizado
- Decision 5 en el acta: SMTP, almacenamiento de archivos, clave de Google
  Maps, push y HTTPS de la API los provee Codigo Creativo en el Sprint 6
  (T-6301..T-6305 en el Sprint Backlog S6). Impedimentos 1, 2 y 4 en gestion;
  HU-004 pasa a En revision.
- S6: todo lo movido de la app queda Por hacer (lo adelantado es MVP interno).
- Retrospective: acuerdo A5 y DoD ajustados.

Co-Authored-By: Claude Opus 5 <noreply@anthropic.com>
</commit_message>
<xml_diff>
--- a/Fase 2/Ceremonias/SIGMA_Sprint_Retrospective_Sprint_1.docx
+++ b/Fase 2/Ceremonias/SIGMA_Sprint_Retrospective_Sprint_1.docx
@@ -397,7 +397,7 @@
               <w:rPr>
                 <w:sz w:val="20"/>
               </w:rPr>
-              <w:t>16 historias en revisión · 1 bloqueada (SMTP)</w:t>
+              <w:t>17 historias en revisión · 0 bloqueada (SMTP)</w:t>
             </w:r>
           </w:p>
         </w:tc>
@@ -625,7 +625,7 @@
         <w:rPr>
           <w:sz w:val="21"/>
         </w:rPr>
-        <w:t>Dependencias externas sin dueño claro hasta la segunda semana: SMTP y almacenamiento de archivos se detectaron el 30-08 y no avanzaron durante el Sprint.</w:t>
+        <w:t>Dependencias externas sin dueño claro hasta la segunda semana: SMTP y almacenamiento de archivos se detectaron el 30-08 y no avanzaron durante el Sprint. Mantener esos temas abiertos en cada sprint web distrae del incremento; conviene tratarlos juntos.</w:t>
       </w:r>
     </w:p>
     <w:p>
@@ -1004,7 +1004,7 @@
               <w:rPr>
                 <w:sz w:val="18"/>
               </w:rPr>
-              <w:t>Dueño y fecha para cada dependencia externa desde el día en que se detecta: SMTP (Emilio, con Hamburgo) y almacenamiento de archivos (Bryan, decidir proveedor).</w:t>
+              <w:t>La infraestructura y los servicios externos (SMTP, almacenamiento de archivos, clave de Google Maps, push, HTTPS de la API) se concentran en el Sprint 6 con dueño por tarea (T-6301 a T-6305) y no se reparten por los sprints web; mientras tanto, cada pantalla que depende de ellos avisa y no falla.</w:t>
             </w:r>
           </w:p>
         </w:tc>
@@ -1018,7 +1018,7 @@
               <w:rPr>
                 <w:sz w:val="18"/>
               </w:rPr>
-              <w:t>Emilio Fuentes</w:t>
+              <w:t>Emilio Fuentes (SMTP, push) / Bryan Chávez (almacenamiento, Maps, HTTPS)</w:t>
             </w:r>
           </w:p>
         </w:tc>
@@ -1032,7 +1032,7 @@
               <w:rPr>
                 <w:sz w:val="18"/>
               </w:rPr>
-              <w:t>Sprint 2</w:t>
+              <w:t>Semana 1 del Sprint 6</w:t>
             </w:r>
           </w:p>
         </w:tc>
@@ -1177,6 +1177,18 @@
           <w:sz w:val="21"/>
         </w:rPr>
         <w:t>Se agrega explícitamente: «las tareas de tipo Móvil de una historia se consideran fuera de la DoD de los Sprints 1 a 5; una historia Web y App se da por terminada en su Sprint con su parte web, y su parte móvil se termina en el Sprint 6».</w:t>
+      </w:r>
+    </w:p>
+    <w:p>
+      <w:pPr>
+        <w:pStyle w:val="ListBullet"/>
+        <w:spacing w:after="60"/>
+      </w:pPr>
+      <w:r>
+        <w:rPr>
+          <w:sz w:val="21"/>
+        </w:rPr>
+        <w:t>Un criterio que dependa de un servicio externo todavía no provisto (correo, archivos, mapas, push) no bloquea la historia en los Sprints 1 a 5: la historia se da por construida con el aviso en pantalla y ese criterio se verifica en el Sprint 6, cuando el servicio exista.</w:t>
       </w:r>
     </w:p>
     <w:p>

</xml_diff>

<commit_message>
Sprint Review y Retrospective del Sprint 3; las retrospectivas llevan el feedback del cliente
- Actas del Sprint 3 (13-10-2026) completas: incremento (28/29 historias,
  82/82 casos), decisiones (HU-151 al S6, HU-076 se verifica con el plan
  del S4), riesgos, y la retro con el seguimiento de A1-A7 y los acuerdos
  A8-A11 (reparto por historia completa desde el S4).
- Toda Sprint Retrospective incluye ahora la seccion "Comentarios y
  feedback del cliente" con lo que dijo Hamburgo en la Review y que hace el
  equipo con cada punto (Retro 1 y 3 completas; la 2 queda para la Review
  del 29-09).

Co-Authored-By: Claude Opus 5.5 <noreply@anthropic.com>
</commit_message>
<xml_diff>
--- a/Fase 2/Ceremonias/SIGMA_Sprint_Retrospective_Sprint_1.docx
+++ b/Fase 2/Ceremonias/SIGMA_Sprint_Retrospective_Sprint_1.docx
@@ -397,7 +397,7 @@
               <w:rPr>
                 <w:sz w:val="20"/>
               </w:rPr>
-              <w:t>17 historias en revisión · 0 bloqueada (SMTP)</w:t>
+              <w:t>0 historias en revisión · 0 bloqueada (SMTP)</w:t>
             </w:r>
           </w:p>
         </w:tc>
@@ -461,7 +461,7 @@
               <w:rPr>
                 <w:sz w:val="20"/>
               </w:rPr>
-              <w:t>25 casos de aceptación · 21 cumplen</w:t>
+              <w:t>46 casos de aceptación · 46 cumplen</w:t>
             </w:r>
           </w:p>
         </w:tc>
@@ -494,6 +494,205 @@
                 <w:sz w:val="20"/>
               </w:rPr>
               <w:t>5 (SMTP, almacenamiento de archivos, repositorio git, clave de Google Maps, recorrido en navegador)</w:t>
+            </w:r>
+          </w:p>
+        </w:tc>
+      </w:tr>
+    </w:tbl>
+    <w:p>
+      <w:pPr>
+        <w:spacing w:after="40"/>
+      </w:pPr>
+    </w:p>
+    <w:p>
+      <w:pPr>
+        <w:pStyle w:val="Heading1"/>
+      </w:pPr>
+      <w:r>
+        <w:t>Comentarios y feedback del cliente</w:t>
+      </w:r>
+    </w:p>
+    <w:p>
+      <w:pPr>
+        <w:spacing w:after="120"/>
+      </w:pPr>
+      <w:r>
+        <w:rPr>
+          <w:b w:val="0"/>
+          <w:i/>
+          <w:sz w:val="21"/>
+        </w:rPr>
+        <w:t>Lo que dijeron los stakeholders de Hamburgo S.A. en la Sprint Review de este Sprint, y qué hace el equipo con cada comentario.</w:t>
+      </w:r>
+    </w:p>
+    <w:tbl>
+      <w:tblPr>
+        <w:tblW w:type="auto" w:w="0"/>
+        <w:tblLook w:firstColumn="1" w:firstRow="1" w:lastColumn="0" w:lastRow="0" w:noHBand="0" w:noVBand="1" w:val="04A0"/>
+        <w:jc w:val="center"/>
+        <w:tblBorders>
+          <w:top w:val="single" w:sz="4" w:color="BFBFBF"/>
+          <w:left w:val="single" w:sz="4" w:color="BFBFBF"/>
+          <w:bottom w:val="single" w:sz="4" w:color="BFBFBF"/>
+          <w:right w:val="single" w:sz="4" w:color="BFBFBF"/>
+          <w:insideH w:val="single" w:sz="4" w:color="BFBFBF"/>
+          <w:insideV w:val="single" w:sz="4" w:color="BFBFBF"/>
+        </w:tblBorders>
+      </w:tblPr>
+      <w:tblGrid>
+        <w:gridCol w:w="4873"/>
+        <w:gridCol w:w="4873"/>
+      </w:tblGrid>
+      <w:tr>
+        <w:tc>
+          <w:tcPr>
+            <w:tcW w:type="dxa" w:w="4819"/>
+            <w:shd w:val="clear" w:color="auto" w:fill="E8E5F7"/>
+          </w:tcPr>
+          <w:p>
+            <w:r/>
+            <w:r>
+              <w:rPr>
+                <w:b/>
+                <w:sz w:val="19"/>
+              </w:rPr>
+              <w:t>Comentario del cliente</w:t>
+            </w:r>
+          </w:p>
+        </w:tc>
+        <w:tc>
+          <w:tcPr>
+            <w:tcW w:type="dxa" w:w="4535"/>
+            <w:shd w:val="clear" w:color="auto" w:fill="E8E5F7"/>
+          </w:tcPr>
+          <w:p>
+            <w:r/>
+            <w:r>
+              <w:rPr>
+                <w:b/>
+                <w:sz w:val="19"/>
+              </w:rPr>
+              <w:t>Qué hace el equipo</w:t>
+            </w:r>
+          </w:p>
+        </w:tc>
+      </w:tr>
+      <w:tr>
+        <w:tc>
+          <w:tcPr>
+            <w:tcW w:type="dxa" w:w="4819"/>
+          </w:tcPr>
+          <w:p>
+            <w:r/>
+            <w:r>
+              <w:rPr>
+                <w:sz w:val="19"/>
+              </w:rPr>
+              <w:t>Lo primero que necesitan es la configuración base desde la web: plantas, áreas, usuarios, perfiles, activos, repuestos y planes.</w:t>
+            </w:r>
+          </w:p>
+        </w:tc>
+        <w:tc>
+          <w:tcPr>
+            <w:tcW w:type="dxa" w:w="4535"/>
+          </w:tcPr>
+          <w:p>
+            <w:r/>
+            <w:r>
+              <w:rPr>
+                <w:sz w:val="19"/>
+              </w:rPr>
+              <w:t>Los Sprints 1 a 5 se concentran en la web (acuerdo A1).</w:t>
+            </w:r>
+          </w:p>
+        </w:tc>
+      </w:tr>
+      <w:tr>
+        <w:tc>
+          <w:tcPr>
+            <w:tcW w:type="dxa" w:w="4819"/>
+          </w:tcPr>
+          <w:p>
+            <w:r/>
+            <w:r>
+              <w:rPr>
+                <w:sz w:val="19"/>
+              </w:rPr>
+              <w:t>Un inicio de sesión en la app en el Sprint 1 no genera impacto: el técnico entra cuando hay órdenes, pautas y equipos configurados.</w:t>
+            </w:r>
+          </w:p>
+        </w:tc>
+        <w:tc>
+          <w:tcPr>
+            <w:tcW w:type="dxa" w:w="4535"/>
+          </w:tcPr>
+          <w:p>
+            <w:r/>
+            <w:r>
+              <w:rPr>
+                <w:sz w:val="19"/>
+              </w:rPr>
+              <w:t>Las tareas Móvil se reprograman al Sprint 6; lo que se adelante de la app es MVP interno (A1).</w:t>
+            </w:r>
+          </w:p>
+        </w:tc>
+      </w:tr>
+      <w:tr>
+        <w:tc>
+          <w:tcPr>
+            <w:tcW w:type="dxa" w:w="4819"/>
+          </w:tcPr>
+          <w:p>
+            <w:r/>
+            <w:r>
+              <w:rPr>
+                <w:sz w:val="19"/>
+              </w:rPr>
+              <w:t>Piden la aplicación móvil completa en un Sprint dedicado, al final, sobre datos reales de la planta.</w:t>
+            </w:r>
+          </w:p>
+        </w:tc>
+        <w:tc>
+          <w:tcPr>
+            <w:tcW w:type="dxa" w:w="4535"/>
+          </w:tcPr>
+          <w:p>
+            <w:r/>
+            <w:r>
+              <w:rPr>
+                <w:sz w:val="19"/>
+              </w:rPr>
+              <w:t>La app se entrega en el Sprint 6 y se refina su alcance antes del Planning 6 (A4).</w:t>
+            </w:r>
+          </w:p>
+        </w:tc>
+      </w:tr>
+      <w:tr>
+        <w:tc>
+          <w:tcPr>
+            <w:tcW w:type="dxa" w:w="4819"/>
+          </w:tcPr>
+          <w:p>
+            <w:r/>
+            <w:r>
+              <w:rPr>
+                <w:sz w:val="19"/>
+              </w:rPr>
+              <w:t>El alcance funcional de la app no cambia: lo que se pide es el orden de entrega.</w:t>
+            </w:r>
+          </w:p>
+        </w:tc>
+        <w:tc>
+          <w:tcPr>
+            <w:tcW w:type="dxa" w:w="4535"/>
+          </w:tcPr>
+          <w:p>
+            <w:r/>
+            <w:r>
+              <w:rPr>
+                <w:sz w:val="19"/>
+              </w:rPr>
+              <w:t>El lado servidor de la app se sigue construyendo en cada Sprint (A2).</w:t>
             </w:r>
           </w:p>
         </w:tc>

</xml_diff>